<commit_message>
export endpoint and revised some functionality to solve issue #19. The docx_generator now accepts both a full JSON string and a .json file for flexibility. The fastAPI part in main.py has been created
</commit_message>
<xml_diff>
--- a/docx_generator/template/meldingsformulier-template.docx
+++ b/docx_generator/template/meldingsformulier-template.docx
@@ -36,8 +36,8 @@
         <w:ind w:left="0"/>
         <w:rPr/>
       </w:pPr>
-      <w:bookmarkStart w:id="0" w:name="_Toc139032098"/>
-      <w:bookmarkStart w:id="1" w:name="_Toc510009551"/>
+      <w:bookmarkStart w:id="0" w:name="_Toc510009551"/>
+      <w:bookmarkStart w:id="1" w:name="_Toc139032098"/>
       <w:bookmarkEnd w:id="0"/>
       <w:bookmarkEnd w:id="1"/>
       <w:r>
@@ -502,30 +502,20 @@
           <w:sz w:val="18"/>
           <w:szCs w:val="18"/>
         </w:rPr>
-        <w:t xml:space="preserve"> [</w:t>
-      </w:r>
-      <w:r>
-        <w:rPr>
-          <w:sz w:val="18"/>
-          <w:szCs w:val="18"/>
-        </w:rPr>
-        <w:t>b</w:t>
-      </w:r>
-      <w:r>
-        <w:rPr>
-          <w:b w:val="false"/>
-          <w:bCs w:val="false"/>
-          <w:sz w:val="18"/>
-          <w:szCs w:val="18"/>
-        </w:rPr>
-        <w:t>etrouwbaarheid transcriptie</w:t>
-      </w:r>
-      <w:r>
-        <w:rPr>
-          <w:sz w:val="18"/>
-          <w:szCs w:val="18"/>
-        </w:rPr>
-        <w:t xml:space="preserve"> hoog / gemiddeld / laag]</w:t>
+        <w:t xml:space="preserve"> </w:t>
+      </w:r>
+      <w:r>
+        <w:rPr>
+          <w:sz w:val="18"/>
+          <w:szCs w:val="18"/>
+        </w:rPr>
+        <w:t>[betrouwbaarheid transcriptie hoog / gemiddeld / laag]</w:t>
+      </w:r>
+      <w:r>
+        <w:rPr>
+          <w:sz w:val="18"/>
+          <w:szCs w:val="18"/>
+        </w:rPr>
         <w:br/>
       </w:r>
     </w:p>
@@ -1467,31 +1457,6 @@
           <w:sz w:val="18"/>
           <w:szCs w:val="18"/>
         </w:rPr>
-        <w:t xml:space="preserve"> [</w:t>
-      </w:r>
-      <w:r>
-        <w:rPr>
-          <w:sz w:val="18"/>
-          <w:szCs w:val="18"/>
-        </w:rPr>
-        <w:t>r</w:t>
-      </w:r>
-      <w:r>
-        <w:rPr>
-          <w:b w:val="false"/>
-          <w:bCs w:val="false"/>
-          <w:sz w:val="18"/>
-          <w:szCs w:val="18"/>
-        </w:rPr>
-        <w:t>elevantie van zoekresultaat</w:t>
-      </w:r>
-      <w:r>
-        <w:rPr>
-          <w:b/>
-          <w:bCs/>
-          <w:sz w:val="18"/>
-          <w:szCs w:val="18"/>
-        </w:rPr>
         <w:t xml:space="preserve"> </w:t>
       </w:r>
       <w:r>
@@ -1499,7 +1464,7 @@
           <w:sz w:val="18"/>
           <w:szCs w:val="18"/>
         </w:rPr>
-        <w:t>hoog / gemiddeld / laag]</w:t>
+        <w:t>[relevantie van zoekresultaat hoog / gemiddeld / laag]</w:t>
       </w:r>
     </w:p>
     <w:p>
@@ -1507,8 +1472,9 @@
         <w:pStyle w:val="Lijstalinea1"/>
         <w:ind w:left="0"/>
         <w:rPr>
-          <w:sz w:val="18"/>
-          <w:szCs w:val="18"/>
+          <w:sz w:val="24"/>
+          <w:szCs w:val="24"/>
+          <w14:ligatures w14:val="standardContextual"/>
         </w:rPr>
       </w:pPr>
       <w:r>
@@ -1996,7 +1962,7 @@
       <mc:AlternateContent>
         <mc:Choice Requires="wps">
           <w:drawing>
-            <wp:anchor behindDoc="1" distT="12065" distB="10795" distL="11430" distR="11430" simplePos="0" locked="0" layoutInCell="1" allowOverlap="1" relativeHeight="16" wp14:anchorId="43DFE341">
+            <wp:anchor behindDoc="1" distT="12065" distB="10795" distL="11430" distR="11430" simplePos="0" locked="0" layoutInCell="1" allowOverlap="1" relativeHeight="20" wp14:anchorId="43DFE341">
               <wp:simplePos x="0" y="0"/>
               <wp:positionH relativeFrom="column">
                 <wp:posOffset>-342900</wp:posOffset>
@@ -2040,7 +2006,7 @@
                       <w:txbxContent>
                         <w:p>
                           <w:pPr>
-                            <w:pStyle w:val="FrameContentsuser"/>
+                            <w:pStyle w:val="FrameContents"/>
                             <w:rPr>
                               <w:rFonts w:cs="Arial"/>
                               <w:sz w:val="18"/>
@@ -2131,7 +2097,7 @@
                         </w:p>
                         <w:p>
                           <w:pPr>
-                            <w:pStyle w:val="FrameContentsuser"/>
+                            <w:pStyle w:val="FrameContents"/>
                             <w:rPr>
                               <w:rFonts w:cs="Arial"/>
                               <w:sz w:val="18"/>
@@ -2151,7 +2117,7 @@
                         </w:p>
                         <w:p>
                           <w:pPr>
-                            <w:pStyle w:val="FrameContentsuser"/>
+                            <w:pStyle w:val="FrameContents"/>
                             <w:rPr>
                               <w:rFonts w:cs="Arial"/>
                               <w:sz w:val="18"/>
@@ -2171,7 +2137,7 @@
                         </w:p>
                         <w:p>
                           <w:pPr>
-                            <w:pStyle w:val="FrameContentsuser"/>
+                            <w:pStyle w:val="FrameContents"/>
                             <w:rPr>
                               <w:sz w:val="18"/>
                               <w:szCs w:val="18"/>
@@ -2209,7 +2175,7 @@
                 <w:txbxContent>
                   <w:p>
                     <w:pPr>
-                      <w:pStyle w:val="FrameContentsuser"/>
+                      <w:pStyle w:val="FrameContents"/>
                       <w:rPr>
                         <w:rFonts w:cs="Arial"/>
                         <w:sz w:val="18"/>
@@ -2300,7 +2266,7 @@
                   </w:p>
                   <w:p>
                     <w:pPr>
-                      <w:pStyle w:val="FrameContentsuser"/>
+                      <w:pStyle w:val="FrameContents"/>
                       <w:rPr>
                         <w:rFonts w:cs="Arial"/>
                         <w:sz w:val="18"/>
@@ -2320,7 +2286,7 @@
                   </w:p>
                   <w:p>
                     <w:pPr>
-                      <w:pStyle w:val="FrameContentsuser"/>
+                      <w:pStyle w:val="FrameContents"/>
                       <w:rPr>
                         <w:rFonts w:cs="Arial"/>
                         <w:sz w:val="18"/>
@@ -2340,7 +2306,7 @@
                   </w:p>
                   <w:p>
                     <w:pPr>
-                      <w:pStyle w:val="FrameContentsuser"/>
+                      <w:pStyle w:val="FrameContents"/>
                       <w:rPr>
                         <w:sz w:val="18"/>
                         <w:szCs w:val="18"/>
@@ -2368,7 +2334,7 @@
       <mc:AlternateContent>
         <mc:Choice Requires="wps">
           <w:drawing>
-            <wp:anchor behindDoc="1" distT="12065" distB="10795" distL="11430" distR="11430" simplePos="0" locked="0" layoutInCell="1" allowOverlap="1" relativeHeight="31" wp14:anchorId="43DFE343">
+            <wp:anchor behindDoc="1" distT="12065" distB="10795" distL="11430" distR="11430" simplePos="0" locked="0" layoutInCell="1" allowOverlap="1" relativeHeight="38" wp14:anchorId="43DFE343">
               <wp:simplePos x="0" y="0"/>
               <wp:positionH relativeFrom="column">
                 <wp:posOffset>1714500</wp:posOffset>
@@ -2412,7 +2378,7 @@
                       <w:txbxContent>
                         <w:p>
                           <w:pPr>
-                            <w:pStyle w:val="FrameContentsuser"/>
+                            <w:pStyle w:val="FrameContents"/>
                             <w:rPr>
                               <w:rFonts w:cs="Arial"/>
                               <w:sz w:val="18"/>
@@ -2457,7 +2423,7 @@
                 <w:txbxContent>
                   <w:p>
                     <w:pPr>
-                      <w:pStyle w:val="FrameContentsuser"/>
+                      <w:pStyle w:val="FrameContents"/>
                       <w:rPr>
                         <w:rFonts w:cs="Arial"/>
                         <w:sz w:val="18"/>
@@ -2492,7 +2458,7 @@
       <mc:AlternateContent>
         <mc:Choice Requires="wps">
           <w:drawing>
-            <wp:anchor behindDoc="1" distT="12065" distB="10795" distL="11430" distR="11430" simplePos="0" locked="0" layoutInCell="1" allowOverlap="1" relativeHeight="52" wp14:anchorId="43DFE345">
+            <wp:anchor behindDoc="1" distT="12065" distB="10795" distL="11430" distR="11430" simplePos="0" locked="0" layoutInCell="1" allowOverlap="1" relativeHeight="56" wp14:anchorId="43DFE345">
               <wp:simplePos x="0" y="0"/>
               <wp:positionH relativeFrom="column">
                 <wp:posOffset>3543300</wp:posOffset>
@@ -2536,7 +2502,7 @@
                       <w:txbxContent>
                         <w:p>
                           <w:pPr>
-                            <w:pStyle w:val="FrameContentsuser"/>
+                            <w:pStyle w:val="FrameContents"/>
                             <w:rPr>
                               <w:sz w:val="18"/>
                               <w:szCs w:val="18"/>
@@ -2601,7 +2567,7 @@
                         </w:p>
                         <w:p>
                           <w:pPr>
-                            <w:pStyle w:val="FrameContentsuser"/>
+                            <w:pStyle w:val="FrameContents"/>
                             <w:rPr>
                               <w:lang w:val="fr-FR"/>
                             </w:rPr>
@@ -2633,7 +2599,7 @@
                 <w:txbxContent>
                   <w:p>
                     <w:pPr>
-                      <w:pStyle w:val="FrameContentsuser"/>
+                      <w:pStyle w:val="FrameContents"/>
                       <w:rPr>
                         <w:sz w:val="18"/>
                         <w:szCs w:val="18"/>
@@ -2698,7 +2664,7 @@
                   </w:p>
                   <w:p>
                     <w:pPr>
-                      <w:pStyle w:val="FrameContentsuser"/>
+                      <w:pStyle w:val="FrameContents"/>
                       <w:rPr>
                         <w:lang w:val="fr-FR"/>
                       </w:rPr>
@@ -2720,7 +2686,7 @@
       <mc:AlternateContent>
         <mc:Choice Requires="wps">
           <w:drawing>
-            <wp:anchor behindDoc="1" distT="12065" distB="10795" distL="11430" distR="11430" simplePos="0" locked="0" layoutInCell="1" allowOverlap="1" relativeHeight="59" wp14:anchorId="43DFE347">
+            <wp:anchor behindDoc="1" distT="12065" distB="10795" distL="11430" distR="11430" simplePos="0" locked="0" layoutInCell="1" allowOverlap="1" relativeHeight="63" wp14:anchorId="43DFE347">
               <wp:simplePos x="0" y="0"/>
               <wp:positionH relativeFrom="column">
                 <wp:posOffset>5372100</wp:posOffset>
@@ -2764,7 +2730,7 @@
                       <w:txbxContent>
                         <w:p>
                           <w:pPr>
-                            <w:pStyle w:val="FrameContentsuser"/>
+                            <w:pStyle w:val="FrameContents"/>
                             <w:jc w:val="center"/>
                             <w:rPr>
                               <w:rFonts w:cs="Arial"/>
@@ -2782,7 +2748,7 @@
                         </w:p>
                         <w:p>
                           <w:pPr>
-                            <w:pStyle w:val="FrameContentsuser"/>
+                            <w:pStyle w:val="FrameContents"/>
                             <w:jc w:val="center"/>
                             <w:rPr>
                               <w:rFonts w:cs="Arial"/>
@@ -2799,7 +2765,7 @@
                         </w:p>
                         <w:p>
                           <w:pPr>
-                            <w:pStyle w:val="FrameContentsuser"/>
+                            <w:pStyle w:val="FrameContents"/>
                             <w:jc w:val="center"/>
                             <w:rPr>
                               <w:rFonts w:cs="Arial"/>
@@ -2840,7 +2806,7 @@
                               <w:rFonts w:cs="Arial"/>
                               <w:color w:val="000000"/>
                             </w:rPr>
-                            <w:t>1</w:t>
+                            <w:t>3</w:t>
                           </w:r>
                           <w:r>
                             <w:rPr>
@@ -2935,7 +2901,7 @@
                 <w:txbxContent>
                   <w:p>
                     <w:pPr>
-                      <w:pStyle w:val="FrameContentsuser"/>
+                      <w:pStyle w:val="FrameContents"/>
                       <w:jc w:val="center"/>
                       <w:rPr>
                         <w:rFonts w:cs="Arial"/>
@@ -2953,7 +2919,7 @@
                   </w:p>
                   <w:p>
                     <w:pPr>
-                      <w:pStyle w:val="FrameContentsuser"/>
+                      <w:pStyle w:val="FrameContents"/>
                       <w:jc w:val="center"/>
                       <w:rPr>
                         <w:rFonts w:cs="Arial"/>
@@ -2970,7 +2936,7 @@
                   </w:p>
                   <w:p>
                     <w:pPr>
-                      <w:pStyle w:val="FrameContentsuser"/>
+                      <w:pStyle w:val="FrameContents"/>
                       <w:jc w:val="center"/>
                       <w:rPr>
                         <w:rFonts w:cs="Arial"/>
@@ -3011,7 +2977,7 @@
                         <w:rFonts w:cs="Arial"/>
                         <w:color w:val="000000"/>
                       </w:rPr>
-                      <w:t>1</w:t>
+                      <w:t>3</w:t>
                     </w:r>
                     <w:r>
                       <w:rPr>
@@ -3131,7 +3097,7 @@
       <mc:AlternateContent>
         <mc:Choice Requires="wps">
           <w:drawing>
-            <wp:anchor behindDoc="1" distT="12065" distB="10795" distL="11430" distR="11430" simplePos="0" locked="0" layoutInCell="1" allowOverlap="1" relativeHeight="16" wp14:anchorId="43DFE341">
+            <wp:anchor behindDoc="1" distT="12065" distB="10795" distL="11430" distR="11430" simplePos="0" locked="0" layoutInCell="1" allowOverlap="1" relativeHeight="20" wp14:anchorId="43DFE341">
               <wp:simplePos x="0" y="0"/>
               <wp:positionH relativeFrom="column">
                 <wp:posOffset>-342900</wp:posOffset>
@@ -3175,7 +3141,7 @@
                       <w:txbxContent>
                         <w:p>
                           <w:pPr>
-                            <w:pStyle w:val="FrameContentsuser"/>
+                            <w:pStyle w:val="FrameContents"/>
                             <w:rPr>
                               <w:rFonts w:cs="Arial"/>
                               <w:sz w:val="18"/>
@@ -3266,7 +3232,7 @@
                         </w:p>
                         <w:p>
                           <w:pPr>
-                            <w:pStyle w:val="FrameContentsuser"/>
+                            <w:pStyle w:val="FrameContents"/>
                             <w:rPr>
                               <w:rFonts w:cs="Arial"/>
                               <w:sz w:val="18"/>
@@ -3286,7 +3252,7 @@
                         </w:p>
                         <w:p>
                           <w:pPr>
-                            <w:pStyle w:val="FrameContentsuser"/>
+                            <w:pStyle w:val="FrameContents"/>
                             <w:rPr>
                               <w:rFonts w:cs="Arial"/>
                               <w:sz w:val="18"/>
@@ -3306,7 +3272,7 @@
                         </w:p>
                         <w:p>
                           <w:pPr>
-                            <w:pStyle w:val="FrameContentsuser"/>
+                            <w:pStyle w:val="FrameContents"/>
                             <w:rPr>
                               <w:sz w:val="18"/>
                               <w:szCs w:val="18"/>
@@ -3344,7 +3310,7 @@
                 <w:txbxContent>
                   <w:p>
                     <w:pPr>
-                      <w:pStyle w:val="FrameContentsuser"/>
+                      <w:pStyle w:val="FrameContents"/>
                       <w:rPr>
                         <w:rFonts w:cs="Arial"/>
                         <w:sz w:val="18"/>
@@ -3435,7 +3401,7 @@
                   </w:p>
                   <w:p>
                     <w:pPr>
-                      <w:pStyle w:val="FrameContentsuser"/>
+                      <w:pStyle w:val="FrameContents"/>
                       <w:rPr>
                         <w:rFonts w:cs="Arial"/>
                         <w:sz w:val="18"/>
@@ -3455,7 +3421,7 @@
                   </w:p>
                   <w:p>
                     <w:pPr>
-                      <w:pStyle w:val="FrameContentsuser"/>
+                      <w:pStyle w:val="FrameContents"/>
                       <w:rPr>
                         <w:rFonts w:cs="Arial"/>
                         <w:sz w:val="18"/>
@@ -3475,7 +3441,7 @@
                   </w:p>
                   <w:p>
                     <w:pPr>
-                      <w:pStyle w:val="FrameContentsuser"/>
+                      <w:pStyle w:val="FrameContents"/>
                       <w:rPr>
                         <w:sz w:val="18"/>
                         <w:szCs w:val="18"/>
@@ -3503,7 +3469,7 @@
       <mc:AlternateContent>
         <mc:Choice Requires="wps">
           <w:drawing>
-            <wp:anchor behindDoc="1" distT="12065" distB="10795" distL="11430" distR="11430" simplePos="0" locked="0" layoutInCell="1" allowOverlap="1" relativeHeight="31" wp14:anchorId="43DFE343">
+            <wp:anchor behindDoc="1" distT="12065" distB="10795" distL="11430" distR="11430" simplePos="0" locked="0" layoutInCell="1" allowOverlap="1" relativeHeight="38" wp14:anchorId="43DFE343">
               <wp:simplePos x="0" y="0"/>
               <wp:positionH relativeFrom="column">
                 <wp:posOffset>1714500</wp:posOffset>
@@ -3547,7 +3513,7 @@
                       <w:txbxContent>
                         <w:p>
                           <w:pPr>
-                            <w:pStyle w:val="FrameContentsuser"/>
+                            <w:pStyle w:val="FrameContents"/>
                             <w:rPr>
                               <w:rFonts w:cs="Arial"/>
                               <w:sz w:val="18"/>
@@ -3592,7 +3558,7 @@
                 <w:txbxContent>
                   <w:p>
                     <w:pPr>
-                      <w:pStyle w:val="FrameContentsuser"/>
+                      <w:pStyle w:val="FrameContents"/>
                       <w:rPr>
                         <w:rFonts w:cs="Arial"/>
                         <w:sz w:val="18"/>
@@ -3627,7 +3593,7 @@
       <mc:AlternateContent>
         <mc:Choice Requires="wps">
           <w:drawing>
-            <wp:anchor behindDoc="1" distT="12065" distB="10795" distL="11430" distR="11430" simplePos="0" locked="0" layoutInCell="1" allowOverlap="1" relativeHeight="52" wp14:anchorId="43DFE345">
+            <wp:anchor behindDoc="1" distT="12065" distB="10795" distL="11430" distR="11430" simplePos="0" locked="0" layoutInCell="1" allowOverlap="1" relativeHeight="56" wp14:anchorId="43DFE345">
               <wp:simplePos x="0" y="0"/>
               <wp:positionH relativeFrom="column">
                 <wp:posOffset>3543300</wp:posOffset>
@@ -3671,7 +3637,7 @@
                       <w:txbxContent>
                         <w:p>
                           <w:pPr>
-                            <w:pStyle w:val="FrameContentsuser"/>
+                            <w:pStyle w:val="FrameContents"/>
                             <w:rPr>
                               <w:sz w:val="18"/>
                               <w:szCs w:val="18"/>
@@ -3736,7 +3702,7 @@
                         </w:p>
                         <w:p>
                           <w:pPr>
-                            <w:pStyle w:val="FrameContentsuser"/>
+                            <w:pStyle w:val="FrameContents"/>
                             <w:rPr>
                               <w:lang w:val="fr-FR"/>
                             </w:rPr>
@@ -3768,7 +3734,7 @@
                 <w:txbxContent>
                   <w:p>
                     <w:pPr>
-                      <w:pStyle w:val="FrameContentsuser"/>
+                      <w:pStyle w:val="FrameContents"/>
                       <w:rPr>
                         <w:sz w:val="18"/>
                         <w:szCs w:val="18"/>
@@ -3833,7 +3799,7 @@
                   </w:p>
                   <w:p>
                     <w:pPr>
-                      <w:pStyle w:val="FrameContentsuser"/>
+                      <w:pStyle w:val="FrameContents"/>
                       <w:rPr>
                         <w:lang w:val="fr-FR"/>
                       </w:rPr>
@@ -3855,7 +3821,7 @@
       <mc:AlternateContent>
         <mc:Choice Requires="wps">
           <w:drawing>
-            <wp:anchor behindDoc="1" distT="12065" distB="10795" distL="11430" distR="11430" simplePos="0" locked="0" layoutInCell="1" allowOverlap="1" relativeHeight="59" wp14:anchorId="43DFE347">
+            <wp:anchor behindDoc="1" distT="12065" distB="10795" distL="11430" distR="11430" simplePos="0" locked="0" layoutInCell="1" allowOverlap="1" relativeHeight="63" wp14:anchorId="43DFE347">
               <wp:simplePos x="0" y="0"/>
               <wp:positionH relativeFrom="column">
                 <wp:posOffset>5372100</wp:posOffset>
@@ -3899,7 +3865,7 @@
                       <w:txbxContent>
                         <w:p>
                           <w:pPr>
-                            <w:pStyle w:val="FrameContentsuser"/>
+                            <w:pStyle w:val="FrameContents"/>
                             <w:jc w:val="center"/>
                             <w:rPr>
                               <w:rFonts w:cs="Arial"/>
@@ -3917,7 +3883,7 @@
                         </w:p>
                         <w:p>
                           <w:pPr>
-                            <w:pStyle w:val="FrameContentsuser"/>
+                            <w:pStyle w:val="FrameContents"/>
                             <w:jc w:val="center"/>
                             <w:rPr>
                               <w:rFonts w:cs="Arial"/>
@@ -3934,7 +3900,7 @@
                         </w:p>
                         <w:p>
                           <w:pPr>
-                            <w:pStyle w:val="FrameContentsuser"/>
+                            <w:pStyle w:val="FrameContents"/>
                             <w:jc w:val="center"/>
                             <w:rPr>
                               <w:rFonts w:cs="Arial"/>
@@ -3975,7 +3941,7 @@
                               <w:rFonts w:cs="Arial"/>
                               <w:color w:val="000000"/>
                             </w:rPr>
-                            <w:t>1</w:t>
+                            <w:t>3</w:t>
                           </w:r>
                           <w:r>
                             <w:rPr>
@@ -4070,7 +4036,7 @@
                 <w:txbxContent>
                   <w:p>
                     <w:pPr>
-                      <w:pStyle w:val="FrameContentsuser"/>
+                      <w:pStyle w:val="FrameContents"/>
                       <w:jc w:val="center"/>
                       <w:rPr>
                         <w:rFonts w:cs="Arial"/>
@@ -4088,7 +4054,7 @@
                   </w:p>
                   <w:p>
                     <w:pPr>
-                      <w:pStyle w:val="FrameContentsuser"/>
+                      <w:pStyle w:val="FrameContents"/>
                       <w:jc w:val="center"/>
                       <w:rPr>
                         <w:rFonts w:cs="Arial"/>
@@ -4105,7 +4071,7 @@
                   </w:p>
                   <w:p>
                     <w:pPr>
-                      <w:pStyle w:val="FrameContentsuser"/>
+                      <w:pStyle w:val="FrameContents"/>
                       <w:jc w:val="center"/>
                       <w:rPr>
                         <w:rFonts w:cs="Arial"/>
@@ -4146,7 +4112,7 @@
                         <w:rFonts w:cs="Arial"/>
                         <w:color w:val="000000"/>
                       </w:rPr>
-                      <w:t>1</w:t>
+                      <w:t>3</w:t>
                     </w:r>
                     <w:r>
                       <w:rPr>
@@ -4323,7 +4289,7 @@
                       <w:txbxContent>
                         <w:p>
                           <w:pPr>
-                            <w:pStyle w:val="FrameContentsuser"/>
+                            <w:pStyle w:val="FrameContents"/>
                             <w:jc w:val="center"/>
                             <w:rPr>
                               <w:rFonts w:cs="Arial"/>
@@ -4343,7 +4309,7 @@
                         </w:p>
                         <w:p>
                           <w:pPr>
-                            <w:pStyle w:val="FrameContentsuser"/>
+                            <w:pStyle w:val="FrameContents"/>
                             <w:jc w:val="center"/>
                             <w:rPr>
                               <w:rFonts w:cs="Arial"/>
@@ -4368,7 +4334,7 @@
                         </w:p>
                         <w:p>
                           <w:pPr>
-                            <w:pStyle w:val="FrameContentsuser"/>
+                            <w:pStyle w:val="FrameContents"/>
                             <w:jc w:val="center"/>
                             <w:rPr>
                               <w:rFonts w:cs="Arial"/>
@@ -4459,7 +4425,7 @@
                 <w:txbxContent>
                   <w:p>
                     <w:pPr>
-                      <w:pStyle w:val="FrameContentsuser"/>
+                      <w:pStyle w:val="FrameContents"/>
                       <w:jc w:val="center"/>
                       <w:rPr>
                         <w:rFonts w:cs="Arial"/>
@@ -4479,7 +4445,7 @@
                   </w:p>
                   <w:p>
                     <w:pPr>
-                      <w:pStyle w:val="FrameContentsuser"/>
+                      <w:pStyle w:val="FrameContents"/>
                       <w:jc w:val="center"/>
                       <w:rPr>
                         <w:rFonts w:cs="Arial"/>
@@ -4504,7 +4470,7 @@
                   </w:p>
                   <w:p>
                     <w:pPr>
-                      <w:pStyle w:val="FrameContentsuser"/>
+                      <w:pStyle w:val="FrameContents"/>
                       <w:jc w:val="center"/>
                       <w:rPr>
                         <w:rFonts w:cs="Arial"/>
@@ -4643,7 +4609,7 @@
       <mc:AlternateContent>
         <mc:Choice Requires="wps">
           <w:drawing>
-            <wp:anchor behindDoc="1" distT="11430" distB="11430" distL="11430" distR="11430" simplePos="0" locked="0" layoutInCell="1" allowOverlap="1" relativeHeight="22" wp14:anchorId="43DFE335">
+            <wp:anchor behindDoc="1" distT="11430" distB="11430" distL="11430" distR="11430" simplePos="0" locked="0" layoutInCell="1" allowOverlap="1" relativeHeight="15" wp14:anchorId="43DFE335">
               <wp:simplePos x="0" y="0"/>
               <wp:positionH relativeFrom="column">
                 <wp:posOffset>6515100</wp:posOffset>
@@ -4757,7 +4723,7 @@
       <mc:AlternateContent>
         <mc:Choice Requires="wps">
           <w:drawing>
-            <wp:anchor behindDoc="1" distT="0" distB="0" distL="0" distR="0" simplePos="0" locked="0" layoutInCell="1" allowOverlap="1" relativeHeight="39" wp14:anchorId="43DFE339">
+            <wp:anchor behindDoc="1" distT="0" distB="0" distL="0" distR="0" simplePos="0" locked="0" layoutInCell="1" allowOverlap="1" relativeHeight="32" wp14:anchorId="43DFE339">
               <wp:simplePos x="0" y="0"/>
               <wp:positionH relativeFrom="column">
                 <wp:posOffset>1826895</wp:posOffset>
@@ -4796,7 +4762,7 @@
                       <w:txbxContent>
                         <w:p>
                           <w:pPr>
-                            <w:pStyle w:val="FrameContentsuser"/>
+                            <w:pStyle w:val="FrameContents"/>
                             <w:jc w:val="center"/>
                             <w:rPr>
                               <w:rFonts w:cs="Arial"/>
@@ -4830,7 +4796,7 @@
                 <w:txbxContent>
                   <w:p>
                     <w:pPr>
-                      <w:pStyle w:val="FrameContentsuser"/>
+                      <w:pStyle w:val="FrameContents"/>
                       <w:jc w:val="center"/>
                       <w:rPr>
                         <w:rFonts w:cs="Arial"/>
@@ -5016,7 +4982,7 @@
         </mc:Fallback>
       </mc:AlternateContent>
       <w:drawing>
-        <wp:anchor behindDoc="1" distT="0" distB="0" distL="0" distR="0" simplePos="0" locked="0" layoutInCell="1" allowOverlap="1" relativeHeight="65">
+        <wp:anchor behindDoc="1" distT="0" distB="0" distL="0" distR="0" simplePos="0" locked="0" layoutInCell="1" allowOverlap="1" relativeHeight="51">
           <wp:simplePos x="0" y="0"/>
           <wp:positionH relativeFrom="column">
             <wp:posOffset>-203200</wp:posOffset>
@@ -5126,7 +5092,7 @@
                       <w:txbxContent>
                         <w:p>
                           <w:pPr>
-                            <w:pStyle w:val="FrameContentsuser"/>
+                            <w:pStyle w:val="FrameContents"/>
                             <w:jc w:val="center"/>
                             <w:rPr>
                               <w:rFonts w:cs="Arial"/>
@@ -5146,7 +5112,7 @@
                         </w:p>
                         <w:p>
                           <w:pPr>
-                            <w:pStyle w:val="FrameContentsuser"/>
+                            <w:pStyle w:val="FrameContents"/>
                             <w:jc w:val="center"/>
                             <w:rPr>
                               <w:rFonts w:cs="Arial"/>
@@ -5171,7 +5137,7 @@
                         </w:p>
                         <w:p>
                           <w:pPr>
-                            <w:pStyle w:val="FrameContentsuser"/>
+                            <w:pStyle w:val="FrameContents"/>
                             <w:jc w:val="center"/>
                             <w:rPr>
                               <w:rFonts w:cs="Arial"/>
@@ -5262,7 +5228,7 @@
                 <w:txbxContent>
                   <w:p>
                     <w:pPr>
-                      <w:pStyle w:val="FrameContentsuser"/>
+                      <w:pStyle w:val="FrameContents"/>
                       <w:jc w:val="center"/>
                       <w:rPr>
                         <w:rFonts w:cs="Arial"/>
@@ -5282,7 +5248,7 @@
                   </w:p>
                   <w:p>
                     <w:pPr>
-                      <w:pStyle w:val="FrameContentsuser"/>
+                      <w:pStyle w:val="FrameContents"/>
                       <w:jc w:val="center"/>
                       <w:rPr>
                         <w:rFonts w:cs="Arial"/>
@@ -5307,7 +5273,7 @@
                   </w:p>
                   <w:p>
                     <w:pPr>
-                      <w:pStyle w:val="FrameContentsuser"/>
+                      <w:pStyle w:val="FrameContents"/>
                       <w:jc w:val="center"/>
                       <w:rPr>
                         <w:rFonts w:cs="Arial"/>
@@ -5446,7 +5412,7 @@
       <mc:AlternateContent>
         <mc:Choice Requires="wps">
           <w:drawing>
-            <wp:anchor behindDoc="1" distT="11430" distB="11430" distL="11430" distR="11430" simplePos="0" locked="0" layoutInCell="1" allowOverlap="1" relativeHeight="22" wp14:anchorId="43DFE335">
+            <wp:anchor behindDoc="1" distT="11430" distB="11430" distL="11430" distR="11430" simplePos="0" locked="0" layoutInCell="1" allowOverlap="1" relativeHeight="15" wp14:anchorId="43DFE335">
               <wp:simplePos x="0" y="0"/>
               <wp:positionH relativeFrom="column">
                 <wp:posOffset>6515100</wp:posOffset>
@@ -5560,7 +5526,7 @@
       <mc:AlternateContent>
         <mc:Choice Requires="wps">
           <w:drawing>
-            <wp:anchor behindDoc="1" distT="0" distB="0" distL="0" distR="0" simplePos="0" locked="0" layoutInCell="1" allowOverlap="1" relativeHeight="39" wp14:anchorId="43DFE339">
+            <wp:anchor behindDoc="1" distT="0" distB="0" distL="0" distR="0" simplePos="0" locked="0" layoutInCell="1" allowOverlap="1" relativeHeight="32" wp14:anchorId="43DFE339">
               <wp:simplePos x="0" y="0"/>
               <wp:positionH relativeFrom="column">
                 <wp:posOffset>1826895</wp:posOffset>
@@ -5599,7 +5565,7 @@
                       <w:txbxContent>
                         <w:p>
                           <w:pPr>
-                            <w:pStyle w:val="FrameContentsuser"/>
+                            <w:pStyle w:val="FrameContents"/>
                             <w:jc w:val="center"/>
                             <w:rPr>
                               <w:rFonts w:cs="Arial"/>
@@ -5633,7 +5599,7 @@
                 <w:txbxContent>
                   <w:p>
                     <w:pPr>
-                      <w:pStyle w:val="FrameContentsuser"/>
+                      <w:pStyle w:val="FrameContents"/>
                       <w:jc w:val="center"/>
                       <w:rPr>
                         <w:rFonts w:cs="Arial"/>
@@ -5819,7 +5785,7 @@
         </mc:Fallback>
       </mc:AlternateContent>
       <w:drawing>
-        <wp:anchor behindDoc="1" distT="0" distB="0" distL="0" distR="0" simplePos="0" locked="0" layoutInCell="1" allowOverlap="1" relativeHeight="65">
+        <wp:anchor behindDoc="1" distT="0" distB="0" distL="0" distR="0" simplePos="0" locked="0" layoutInCell="1" allowOverlap="1" relativeHeight="51">
           <wp:simplePos x="0" y="0"/>
           <wp:positionH relativeFrom="column">
             <wp:posOffset>-203200</wp:posOffset>
@@ -6862,8 +6828,8 @@
     <w:qFormat/>
     <w:rPr/>
   </w:style>
-  <w:style w:type="character" w:styleId="Bullets" w:customStyle="1">
-    <w:name w:val="Bullets"/>
+  <w:style w:type="character" w:styleId="Bulletsuser" w:customStyle="1">
+    <w:name w:val="Bullets (user)"/>
     <w:qFormat/>
     <w:rPr>
       <w:rFonts w:ascii="OpenSymbol" w:hAnsi="OpenSymbol" w:eastAsia="OpenSymbol" w:cs="OpenSymbol"/>
@@ -7159,15 +7125,15 @@
     <w:pPr/>
     <w:rPr/>
   </w:style>
-  <w:style w:type="paragraph" w:styleId="FrameContentsuser" w:customStyle="1">
-    <w:name w:val="Frame Contents (user)"/>
+  <w:style w:type="paragraph" w:styleId="FrameContents" w:customStyle="1">
+    <w:name w:val="Frame Contents"/>
     <w:basedOn w:val="Normal"/>
     <w:qFormat/>
     <w:pPr/>
     <w:rPr/>
   </w:style>
-  <w:style w:type="paragraph" w:styleId="FrameContents" w:customStyle="1">
-    <w:name w:val="Frame Contents"/>
+  <w:style w:type="paragraph" w:styleId="FrameContentsuser" w:customStyle="1">
+    <w:name w:val="Frame Contents (user)"/>
     <w:basedOn w:val="Normal"/>
     <w:qFormat/>
     <w:pPr/>

</xml_diff>